<commit_message>
Adicionando o conteúdo de Find com os exercícios para o Github - 12/03/2026
</commit_message>
<xml_diff>
--- a/Terceiro_Semestre/Banco_de_Dados_Nao_Relacional/aula_05_find/Exercício Find().docx
+++ b/Terceiro_Semestre/Banco_de_Dados_Nao_Relacional/aula_05_find/Exercício Find().docx
@@ -1,6 +1,6 @@
 
 <file path=word/document.xml><?xml version="1.0" encoding="utf-8"?>
-<w:document xmlns:wpc="http://schemas.microsoft.com/office/word/2010/wordprocessingCanvas" xmlns:cx="http://schemas.microsoft.com/office/drawing/2014/chartex" xmlns:cx1="http://schemas.microsoft.com/office/drawing/2015/9/8/chartex" xmlns:cx2="http://schemas.microsoft.com/office/drawing/2015/10/21/chartex" xmlns:cx3="http://schemas.microsoft.com/office/drawing/2016/5/9/chartex" xmlns:cx4="http://schemas.microsoft.com/office/drawing/2016/5/10/chartex" xmlns:cx5="http://schemas.microsoft.com/office/drawing/2016/5/11/chartex" xmlns:cx6="http://schemas.microsoft.com/office/drawing/2016/5/12/chartex" xmlns:cx7="http://schemas.microsoft.com/office/drawing/2016/5/13/chartex" xmlns:cx8="http://schemas.microsoft.com/office/drawing/2016/5/14/chartex" xmlns:mc="http://schemas.openxmlformats.org/markup-compatibility/2006" xmlns:aink="http://schemas.microsoft.com/office/drawing/2016/ink" xmlns:am3d="http://schemas.microsoft.com/office/drawing/2017/model3d" xmlns:o="urn:schemas-microsoft-com:office:office" xmlns:oel="http://schemas.microsoft.com/office/2019/extlst" xmlns:r="http://schemas.openxmlformats.org/officeDocument/2006/relationships" xmlns:m="http://schemas.openxmlformats.org/officeDocument/2006/math" xmlns:v="urn:schemas-microsoft-com:vml" xmlns:wp14="http://schemas.microsoft.com/office/word/2010/wordprocessingDrawing" xmlns:wp="http://schemas.openxmlformats.org/drawingml/2006/wordprocessingDrawing" xmlns:w10="urn:schemas-microsoft-com:office:word" xmlns:w="http://schemas.openxmlformats.org/wordprocessingml/2006/main" xmlns:w14="http://schemas.microsoft.com/office/word/2010/wordml" xmlns:w15="http://schemas.microsoft.com/office/word/2012/wordml" xmlns:w16cex="http://schemas.microsoft.com/office/word/2018/wordml/cex" xmlns:w16cid="http://schemas.microsoft.com/office/word/2016/wordml/cid" xmlns:w16="http://schemas.microsoft.com/office/word/2018/wordml" xmlns:w16du="http://schemas.microsoft.com/office/word/2023/wordml/word16du" xmlns:w16sdtdh="http://schemas.microsoft.com/office/word/2020/wordml/sdtdatahash" xmlns:w16sdtfl="http://schemas.microsoft.com/office/word/2024/wordml/sdtformatlock" xmlns:w16se="http://schemas.microsoft.com/office/word/2015/wordml/symex" xmlns:wpg="http://schemas.microsoft.com/office/word/2010/wordprocessingGroup" xmlns:wpi="http://schemas.microsoft.com/office/word/2010/wordprocessingInk" xmlns:wne="http://schemas.microsoft.com/office/word/2006/wordml" xmlns:wps="http://schemas.microsoft.com/office/word/2010/wordprocessingShape" mc:Ignorable="w14 w15 w16se w16cid w16 w16cex w16sdtdh w16sdtfl w16du wp14">
+<w:document xmlns:wpc="http://schemas.microsoft.com/office/word/2010/wordprocessingCanvas" xmlns:cx="http://schemas.microsoft.com/office/drawing/2014/chartex" xmlns:cx1="http://schemas.microsoft.com/office/drawing/2015/9/8/chartex" xmlns:cx2="http://schemas.microsoft.com/office/drawing/2015/10/21/chartex" xmlns:cx3="http://schemas.microsoft.com/office/drawing/2016/5/9/chartex" xmlns:cx4="http://schemas.microsoft.com/office/drawing/2016/5/10/chartex" xmlns:cx5="http://schemas.microsoft.com/office/drawing/2016/5/11/chartex" xmlns:cx6="http://schemas.microsoft.com/office/drawing/2016/5/12/chartex" xmlns:cx7="http://schemas.microsoft.com/office/drawing/2016/5/13/chartex" xmlns:cx8="http://schemas.microsoft.com/office/drawing/2016/5/14/chartex" xmlns:mc="http://schemas.openxmlformats.org/markup-compatibility/2006" xmlns:aink="http://schemas.microsoft.com/office/drawing/2016/ink" xmlns:am3d="http://schemas.microsoft.com/office/drawing/2017/model3d" xmlns:o="urn:schemas-microsoft-com:office:office" xmlns:r="http://schemas.openxmlformats.org/officeDocument/2006/relationships" xmlns:m="http://schemas.openxmlformats.org/officeDocument/2006/math" xmlns:v="urn:schemas-microsoft-com:vml" xmlns:wp14="http://schemas.microsoft.com/office/word/2010/wordprocessingDrawing" xmlns:wp="http://schemas.openxmlformats.org/drawingml/2006/wordprocessingDrawing" xmlns:w10="urn:schemas-microsoft-com:office:word" xmlns:w="http://schemas.openxmlformats.org/wordprocessingml/2006/main" xmlns:w14="http://schemas.microsoft.com/office/word/2010/wordml" xmlns:w15="http://schemas.microsoft.com/office/word/2012/wordml" xmlns:w16cex="http://schemas.microsoft.com/office/word/2018/wordml/cex" xmlns:w16cid="http://schemas.microsoft.com/office/word/2016/wordml/cid" xmlns:w16="http://schemas.microsoft.com/office/word/2018/wordml" xmlns:w16sdtdh="http://schemas.microsoft.com/office/word/2020/wordml/sdtdatahash" xmlns:w16se="http://schemas.microsoft.com/office/word/2015/wordml/symex" xmlns:wpg="http://schemas.microsoft.com/office/word/2010/wordprocessingGroup" xmlns:wpi="http://schemas.microsoft.com/office/word/2010/wordprocessingInk" xmlns:wne="http://schemas.microsoft.com/office/word/2006/wordml" xmlns:wps="http://schemas.microsoft.com/office/word/2010/wordprocessingShape" mc:Ignorable="w14 w15 w16se w16cid w16 w16cex w16sdtdh wp14">
   <w:body>
     <w:p>
       <w:pPr>
@@ -273,19 +273,11 @@
       </w:r>
       <w:proofErr w:type="gramEnd"/>
       <w:r>
-        <w:t>.</w:t>
-      </w:r>
-      <w:proofErr w:type="gramStart"/>
-      <w:r>
-        <w:t>insertMany</w:t>
+        <w:t>.insertMany</w:t>
       </w:r>
       <w:proofErr w:type="spellEnd"/>
       <w:r>
-        <w:t>(</w:t>
-      </w:r>
-      <w:proofErr w:type="gramEnd"/>
-      <w:r>
-        <w:t>[</w:t>
+        <w:t>([</w:t>
       </w:r>
     </w:p>
     <w:p>
@@ -349,15 +341,7 @@
       </w:r>
       <w:proofErr w:type="gramEnd"/>
       <w:r>
-        <w:t xml:space="preserve">: "Matemática", nota: </w:t>
-      </w:r>
-      <w:proofErr w:type="gramStart"/>
-      <w:r>
-        <w:t>9 }</w:t>
-      </w:r>
-      <w:proofErr w:type="gramEnd"/>
-      <w:r>
-        <w:t>,</w:t>
+        <w:t>: "Matemática", nota: 9 },</w:t>
       </w:r>
     </w:p>
     <w:p>
@@ -373,15 +357,7 @@
       </w:r>
       <w:proofErr w:type="gramEnd"/>
       <w:r>
-        <w:t xml:space="preserve">: "Português", nota: </w:t>
-      </w:r>
-      <w:proofErr w:type="gramStart"/>
-      <w:r>
-        <w:t>8 }</w:t>
-      </w:r>
-      <w:proofErr w:type="gramEnd"/>
-      <w:r>
-        <w:t>,</w:t>
+        <w:t>: "Português", nota: 8 },</w:t>
       </w:r>
     </w:p>
     <w:p>
@@ -397,13 +373,8 @@
       </w:r>
       <w:proofErr w:type="gramEnd"/>
       <w:r>
-        <w:t xml:space="preserve">: "História", nota: </w:t>
-      </w:r>
-      <w:proofErr w:type="gramStart"/>
-      <w:r>
-        <w:t>7 }</w:t>
-      </w:r>
-      <w:proofErr w:type="gramEnd"/>
+        <w:t>: "História", nota: 7 }</w:t>
+      </w:r>
     </w:p>
     <w:p>
       <w:pPr>
@@ -482,15 +453,7 @@
       </w:r>
       <w:proofErr w:type="gramEnd"/>
       <w:r>
-        <w:t xml:space="preserve">: "Matemática", nota: </w:t>
-      </w:r>
-      <w:proofErr w:type="gramStart"/>
-      <w:r>
-        <w:t>6 }</w:t>
-      </w:r>
-      <w:proofErr w:type="gramEnd"/>
-      <w:r>
-        <w:t>,</w:t>
+        <w:t>: "Matemática", nota: 6 },</w:t>
       </w:r>
     </w:p>
     <w:p>
@@ -506,15 +469,7 @@
       </w:r>
       <w:proofErr w:type="gramEnd"/>
       <w:r>
-        <w:t xml:space="preserve">: "Português", nota: </w:t>
-      </w:r>
-      <w:proofErr w:type="gramStart"/>
-      <w:r>
-        <w:t>7 }</w:t>
-      </w:r>
-      <w:proofErr w:type="gramEnd"/>
-      <w:r>
-        <w:t>,</w:t>
+        <w:t>: "Português", nota: 7 },</w:t>
       </w:r>
     </w:p>
     <w:p>
@@ -530,13 +485,8 @@
       </w:r>
       <w:proofErr w:type="gramEnd"/>
       <w:r>
-        <w:t xml:space="preserve">: "Geografia", nota: </w:t>
-      </w:r>
-      <w:proofErr w:type="gramStart"/>
-      <w:r>
-        <w:t>5 }</w:t>
-      </w:r>
-      <w:proofErr w:type="gramEnd"/>
+        <w:t>: "Geografia", nota: 5 }</w:t>
+      </w:r>
     </w:p>
     <w:p>
       <w:pPr>
@@ -615,15 +565,7 @@
       </w:r>
       <w:proofErr w:type="gramEnd"/>
       <w:r>
-        <w:t xml:space="preserve">: "Matemática", nota: </w:t>
-      </w:r>
-      <w:proofErr w:type="gramStart"/>
-      <w:r>
-        <w:t>10 }</w:t>
-      </w:r>
-      <w:proofErr w:type="gramEnd"/>
-      <w:r>
-        <w:t>,</w:t>
+        <w:t>: "Matemática", nota: 10 },</w:t>
       </w:r>
     </w:p>
     <w:p>
@@ -639,15 +581,7 @@
       </w:r>
       <w:proofErr w:type="gramEnd"/>
       <w:r>
-        <w:t xml:space="preserve">: "História", nota: </w:t>
-      </w:r>
-      <w:proofErr w:type="gramStart"/>
-      <w:r>
-        <w:t>8 }</w:t>
-      </w:r>
-      <w:proofErr w:type="gramEnd"/>
-      <w:r>
-        <w:t>,</w:t>
+        <w:t>: "História", nota: 8 },</w:t>
       </w:r>
     </w:p>
     <w:p>
@@ -663,13 +597,64 @@
       </w:r>
       <w:proofErr w:type="gramEnd"/>
       <w:r>
-        <w:t xml:space="preserve">: "Geografia", nota: </w:t>
-      </w:r>
-      <w:proofErr w:type="gramStart"/>
-      <w:r>
-        <w:t>9 }</w:t>
-      </w:r>
-      <w:proofErr w:type="gramEnd"/>
+        <w:t>: "Geografia", nota: 9 }</w:t>
+      </w:r>
+    </w:p>
+    <w:p>
+      <w:pPr>
+        <w:ind w:left="360"/>
+      </w:pPr>
+      <w:r>
+        <w:t xml:space="preserve"> ]</w:t>
+      </w:r>
+    </w:p>
+    <w:p>
+      <w:pPr>
+        <w:ind w:left="360"/>
+      </w:pPr>
+      <w:r>
+        <w:t>},</w:t>
+      </w:r>
+    </w:p>
+    <w:p>
+      <w:pPr>
+        <w:ind w:left="360"/>
+      </w:pPr>
+      <w:r>
+        <w:t>{</w:t>
+      </w:r>
+    </w:p>
+    <w:p>
+      <w:pPr>
+        <w:ind w:left="360"/>
+      </w:pPr>
+      <w:r>
+        <w:t xml:space="preserve"> id: 4,</w:t>
+      </w:r>
+    </w:p>
+    <w:p>
+      <w:pPr>
+        <w:ind w:left="360"/>
+      </w:pPr>
+      <w:r>
+        <w:t xml:space="preserve"> nome: "Pedro Santos",</w:t>
+      </w:r>
+    </w:p>
+    <w:p>
+      <w:pPr>
+        <w:ind w:left="360"/>
+      </w:pPr>
+      <w:r>
+        <w:t xml:space="preserve"> </w:t>
+      </w:r>
+      <w:proofErr w:type="spellStart"/>
+      <w:r>
+        <w:t>ra</w:t>
+      </w:r>
+      <w:proofErr w:type="spellEnd"/>
+      <w:r>
+        <w:t>: 1004,</w:t>
+      </w:r>
     </w:p>
     <w:p>
       <w:pPr>
@@ -677,6 +662,62 @@
       </w:pPr>
       <w:r>
         <w:lastRenderedPageBreak/>
+        <w:t xml:space="preserve"> disciplinas: [</w:t>
+      </w:r>
+    </w:p>
+    <w:p>
+      <w:pPr>
+        <w:ind w:left="360"/>
+      </w:pPr>
+      <w:r>
+        <w:t xml:space="preserve">  </w:t>
+      </w:r>
+      <w:proofErr w:type="gramStart"/>
+      <w:r>
+        <w:t>{ nome</w:t>
+      </w:r>
+      <w:proofErr w:type="gramEnd"/>
+      <w:r>
+        <w:t>: "Matemática", nota: 5 },</w:t>
+      </w:r>
+    </w:p>
+    <w:p>
+      <w:pPr>
+        <w:ind w:left="360"/>
+      </w:pPr>
+      <w:r>
+        <w:t xml:space="preserve">  </w:t>
+      </w:r>
+      <w:proofErr w:type="gramStart"/>
+      <w:r>
+        <w:t>{ nome</w:t>
+      </w:r>
+      <w:proofErr w:type="gramEnd"/>
+      <w:r>
+        <w:t>: "Português", nota: 6 },</w:t>
+      </w:r>
+    </w:p>
+    <w:p>
+      <w:pPr>
+        <w:ind w:left="360"/>
+      </w:pPr>
+      <w:r>
+        <w:t xml:space="preserve">  </w:t>
+      </w:r>
+      <w:proofErr w:type="gramStart"/>
+      <w:r>
+        <w:t>{ nome</w:t>
+      </w:r>
+      <w:proofErr w:type="gramEnd"/>
+      <w:r>
+        <w:t>: "Biologia", nota: 7 }</w:t>
+      </w:r>
+    </w:p>
+    <w:p>
+      <w:pPr>
+        <w:ind w:left="360"/>
+      </w:pPr>
+      <w:r>
         <w:t xml:space="preserve"> ]</w:t>
       </w:r>
     </w:p>
@@ -701,15 +742,15 @@
         <w:ind w:left="360"/>
       </w:pPr>
       <w:r>
-        <w:t xml:space="preserve"> id: 4,</w:t>
-      </w:r>
-    </w:p>
-    <w:p>
-      <w:pPr>
-        <w:ind w:left="360"/>
-      </w:pPr>
-      <w:r>
-        <w:t xml:space="preserve"> nome: "Pedro Santos",</w:t>
+        <w:t xml:space="preserve"> id: 5,</w:t>
+      </w:r>
+    </w:p>
+    <w:p>
+      <w:pPr>
+        <w:ind w:left="360"/>
+      </w:pPr>
+      <w:r>
+        <w:t xml:space="preserve"> nome: "Juliana Costa",</w:t>
       </w:r>
     </w:p>
     <w:p>
@@ -725,7 +766,7 @@
       </w:r>
       <w:proofErr w:type="spellEnd"/>
       <w:r>
-        <w:t>: 1004,</w:t>
+        <w:t>: 1005,</w:t>
       </w:r>
     </w:p>
     <w:p>
@@ -749,15 +790,7 @@
       </w:r>
       <w:proofErr w:type="gramEnd"/>
       <w:r>
-        <w:t xml:space="preserve">: "Matemática", nota: </w:t>
-      </w:r>
-      <w:proofErr w:type="gramStart"/>
-      <w:r>
-        <w:t>5 }</w:t>
-      </w:r>
-      <w:proofErr w:type="gramEnd"/>
-      <w:r>
-        <w:t>,</w:t>
+        <w:t>: "Matemática", nota: 8 },</w:t>
       </w:r>
     </w:p>
     <w:p>
@@ -773,15 +806,7 @@
       </w:r>
       <w:proofErr w:type="gramEnd"/>
       <w:r>
-        <w:t xml:space="preserve">: "Português", nota: </w:t>
-      </w:r>
-      <w:proofErr w:type="gramStart"/>
-      <w:r>
-        <w:t>6 }</w:t>
-      </w:r>
-      <w:proofErr w:type="gramEnd"/>
-      <w:r>
-        <w:t>,</w:t>
+        <w:t>: "Química", nota: 9 },</w:t>
       </w:r>
     </w:p>
     <w:p>
@@ -797,13 +822,8 @@
       </w:r>
       <w:proofErr w:type="gramEnd"/>
       <w:r>
-        <w:t xml:space="preserve">: "Biologia", nota: </w:t>
-      </w:r>
-      <w:proofErr w:type="gramStart"/>
-      <w:r>
-        <w:t>7 }</w:t>
-      </w:r>
-      <w:proofErr w:type="gramEnd"/>
+        <w:t>: "Física", nota: 7 }</w:t>
+      </w:r>
     </w:p>
     <w:p>
       <w:pPr>
@@ -834,15 +854,15 @@
         <w:ind w:left="360"/>
       </w:pPr>
       <w:r>
-        <w:t xml:space="preserve"> id: 5,</w:t>
-      </w:r>
-    </w:p>
-    <w:p>
-      <w:pPr>
-        <w:ind w:left="360"/>
-      </w:pPr>
-      <w:r>
-        <w:t xml:space="preserve"> nome: "Juliana Costa",</w:t>
+        <w:t xml:space="preserve"> id: 6,</w:t>
+      </w:r>
+    </w:p>
+    <w:p>
+      <w:pPr>
+        <w:ind w:left="360"/>
+      </w:pPr>
+      <w:r>
+        <w:t xml:space="preserve"> nome: "Ricardo Gomes",</w:t>
       </w:r>
     </w:p>
     <w:p>
@@ -858,7 +878,7 @@
       </w:r>
       <w:proofErr w:type="spellEnd"/>
       <w:r>
-        <w:t>: 1005,</w:t>
+        <w:t>: 1006,</w:t>
       </w:r>
     </w:p>
     <w:p>
@@ -882,15 +902,7 @@
       </w:r>
       <w:proofErr w:type="gramEnd"/>
       <w:r>
-        <w:t xml:space="preserve">: "Matemática", nota: </w:t>
-      </w:r>
-      <w:proofErr w:type="gramStart"/>
-      <w:r>
-        <w:t>8 }</w:t>
-      </w:r>
-      <w:proofErr w:type="gramEnd"/>
-      <w:r>
-        <w:t>,</w:t>
+        <w:t>: "Física", nota: 6 },</w:t>
       </w:r>
     </w:p>
     <w:p>
@@ -906,15 +918,7 @@
       </w:r>
       <w:proofErr w:type="gramEnd"/>
       <w:r>
-        <w:t xml:space="preserve">: "Química", nota: </w:t>
-      </w:r>
-      <w:proofErr w:type="gramStart"/>
-      <w:r>
-        <w:t>9 }</w:t>
-      </w:r>
-      <w:proofErr w:type="gramEnd"/>
-      <w:r>
-        <w:t>,</w:t>
+        <w:t>: "Química", nota: 5 },</w:t>
       </w:r>
     </w:p>
     <w:p>
@@ -930,13 +934,8 @@
       </w:r>
       <w:proofErr w:type="gramEnd"/>
       <w:r>
-        <w:t xml:space="preserve">: "Física", nota: </w:t>
-      </w:r>
-      <w:proofErr w:type="gramStart"/>
-      <w:r>
-        <w:t>7 }</w:t>
-      </w:r>
-      <w:proofErr w:type="gramEnd"/>
+        <w:t>: "Matemática", nota: 7 }</w:t>
+      </w:r>
     </w:p>
     <w:p>
       <w:pPr>
@@ -967,15 +966,15 @@
         <w:ind w:left="360"/>
       </w:pPr>
       <w:r>
-        <w:t xml:space="preserve"> id: 6,</w:t>
-      </w:r>
-    </w:p>
-    <w:p>
-      <w:pPr>
-        <w:ind w:left="360"/>
-      </w:pPr>
-      <w:r>
-        <w:t xml:space="preserve"> nome: "Ricardo Gomes",</w:t>
+        <w:t xml:space="preserve"> id: 7,</w:t>
+      </w:r>
+    </w:p>
+    <w:p>
+      <w:pPr>
+        <w:ind w:left="360"/>
+      </w:pPr>
+      <w:r>
+        <w:t xml:space="preserve"> nome: "Fernanda Rocha",</w:t>
       </w:r>
     </w:p>
     <w:p>
@@ -991,7 +990,7 @@
       </w:r>
       <w:proofErr w:type="spellEnd"/>
       <w:r>
-        <w:t>: 1006,</w:t>
+        <w:t>: 1007,</w:t>
       </w:r>
     </w:p>
     <w:p>
@@ -1015,15 +1014,7 @@
       </w:r>
       <w:proofErr w:type="gramEnd"/>
       <w:r>
-        <w:t xml:space="preserve">: "Física", nota: </w:t>
-      </w:r>
-      <w:proofErr w:type="gramStart"/>
-      <w:r>
-        <w:t>6 }</w:t>
-      </w:r>
-      <w:proofErr w:type="gramEnd"/>
-      <w:r>
-        <w:t>,</w:t>
+        <w:t>: "Biologia", nota: 9 },</w:t>
       </w:r>
     </w:p>
     <w:p>
@@ -1039,15 +1030,7 @@
       </w:r>
       <w:proofErr w:type="gramEnd"/>
       <w:r>
-        <w:t xml:space="preserve">: "Química", nota: </w:t>
-      </w:r>
-      <w:proofErr w:type="gramStart"/>
-      <w:r>
-        <w:t>5 }</w:t>
-      </w:r>
-      <w:proofErr w:type="gramEnd"/>
-      <w:r>
-        <w:t>,</w:t>
+        <w:t>: "Química", nota: 8 },</w:t>
       </w:r>
     </w:p>
     <w:p>
@@ -1063,13 +1046,8 @@
       </w:r>
       <w:proofErr w:type="gramEnd"/>
       <w:r>
-        <w:t xml:space="preserve">: "Matemática", nota: </w:t>
-      </w:r>
-      <w:proofErr w:type="gramStart"/>
-      <w:r>
-        <w:t>7 }</w:t>
-      </w:r>
-      <w:proofErr w:type="gramEnd"/>
+        <w:t>: "Matemática", nota: 7 }</w:t>
+      </w:r>
     </w:p>
     <w:p>
       <w:pPr>
@@ -1100,15 +1078,15 @@
         <w:ind w:left="360"/>
       </w:pPr>
       <w:r>
-        <w:t xml:space="preserve"> id: 7,</w:t>
-      </w:r>
-    </w:p>
-    <w:p>
-      <w:pPr>
-        <w:ind w:left="360"/>
-      </w:pPr>
-      <w:r>
-        <w:t xml:space="preserve"> nome: "Fernanda Rocha",</w:t>
+        <w:t xml:space="preserve"> id: 8,</w:t>
+      </w:r>
+    </w:p>
+    <w:p>
+      <w:pPr>
+        <w:ind w:left="360"/>
+      </w:pPr>
+      <w:r>
+        <w:t xml:space="preserve"> nome: "Lucas Pereira",</w:t>
       </w:r>
     </w:p>
     <w:p>
@@ -1124,7 +1102,7 @@
       </w:r>
       <w:proofErr w:type="spellEnd"/>
       <w:r>
-        <w:t>: 1007,</w:t>
+        <w:t>: 1008,</w:t>
       </w:r>
     </w:p>
     <w:p>
@@ -1148,15 +1126,7 @@
       </w:r>
       <w:proofErr w:type="gramEnd"/>
       <w:r>
-        <w:t xml:space="preserve">: "Biologia", nota: </w:t>
-      </w:r>
-      <w:proofErr w:type="gramStart"/>
-      <w:r>
-        <w:t>9 }</w:t>
-      </w:r>
-      <w:proofErr w:type="gramEnd"/>
-      <w:r>
-        <w:t>,</w:t>
+        <w:t>: "Matemática", nota: 4 },</w:t>
       </w:r>
     </w:p>
     <w:p>
@@ -1172,15 +1142,7 @@
       </w:r>
       <w:proofErr w:type="gramEnd"/>
       <w:r>
-        <w:t xml:space="preserve">: "Química", nota: </w:t>
-      </w:r>
-      <w:proofErr w:type="gramStart"/>
-      <w:r>
-        <w:t>8 }</w:t>
-      </w:r>
-      <w:proofErr w:type="gramEnd"/>
-      <w:r>
-        <w:t>,</w:t>
+        <w:t>: "Português", nota: 6 },</w:t>
       </w:r>
     </w:p>
     <w:p>
@@ -1196,13 +1158,8 @@
       </w:r>
       <w:proofErr w:type="gramEnd"/>
       <w:r>
-        <w:t xml:space="preserve">: "Matemática", nota: </w:t>
-      </w:r>
-      <w:proofErr w:type="gramStart"/>
-      <w:r>
-        <w:t>7 }</w:t>
-      </w:r>
-      <w:proofErr w:type="gramEnd"/>
+        <w:t>: "História", nota: 5 }</w:t>
+      </w:r>
     </w:p>
     <w:p>
       <w:pPr>
@@ -1233,15 +1190,15 @@
         <w:ind w:left="360"/>
       </w:pPr>
       <w:r>
-        <w:t xml:space="preserve"> id: 8,</w:t>
-      </w:r>
-    </w:p>
-    <w:p>
-      <w:pPr>
-        <w:ind w:left="360"/>
-      </w:pPr>
-      <w:r>
-        <w:t xml:space="preserve"> nome: "Lucas Pereira",</w:t>
+        <w:t xml:space="preserve"> id: 9,</w:t>
+      </w:r>
+    </w:p>
+    <w:p>
+      <w:pPr>
+        <w:ind w:left="360"/>
+      </w:pPr>
+      <w:r>
+        <w:t xml:space="preserve"> nome: "Camila Martins",</w:t>
       </w:r>
     </w:p>
     <w:p>
@@ -1257,7 +1214,7 @@
       </w:r>
       <w:proofErr w:type="spellEnd"/>
       <w:r>
-        <w:t>: 1008,</w:t>
+        <w:t>: 1009,</w:t>
       </w:r>
     </w:p>
     <w:p>
@@ -1266,6 +1223,22 @@
       </w:pPr>
       <w:r>
         <w:t xml:space="preserve"> disciplinas: [</w:t>
+      </w:r>
+    </w:p>
+    <w:p>
+      <w:pPr>
+        <w:ind w:left="360"/>
+      </w:pPr>
+      <w:r>
+        <w:t xml:space="preserve">  </w:t>
+      </w:r>
+      <w:proofErr w:type="gramStart"/>
+      <w:r>
+        <w:t>{ nome</w:t>
+      </w:r>
+      <w:proofErr w:type="gramEnd"/>
+      <w:r>
+        <w:t>: "Português", nota: 9 },</w:t>
       </w:r>
     </w:p>
     <w:p>
@@ -1282,15 +1255,7 @@
       </w:r>
       <w:proofErr w:type="gramEnd"/>
       <w:r>
-        <w:t xml:space="preserve">: "Matemática", nota: </w:t>
-      </w:r>
-      <w:proofErr w:type="gramStart"/>
-      <w:r>
-        <w:t>4 }</w:t>
-      </w:r>
-      <w:proofErr w:type="gramEnd"/>
-      <w:r>
-        <w:t>,</w:t>
+        <w:t>: "História", nota: 8 },</w:t>
       </w:r>
     </w:p>
     <w:p>
@@ -1306,15 +1271,71 @@
       </w:r>
       <w:proofErr w:type="gramEnd"/>
       <w:r>
-        <w:t xml:space="preserve">: "Português", nota: </w:t>
-      </w:r>
-      <w:proofErr w:type="gramStart"/>
-      <w:r>
-        <w:t>6 }</w:t>
-      </w:r>
-      <w:proofErr w:type="gramEnd"/>
-      <w:r>
-        <w:t>,</w:t>
+        <w:t>: "Geografia", nota: 7 }</w:t>
+      </w:r>
+    </w:p>
+    <w:p>
+      <w:pPr>
+        <w:ind w:left="360"/>
+      </w:pPr>
+      <w:r>
+        <w:t xml:space="preserve"> ]</w:t>
+      </w:r>
+    </w:p>
+    <w:p>
+      <w:pPr>
+        <w:ind w:left="360"/>
+      </w:pPr>
+      <w:r>
+        <w:t>},</w:t>
+      </w:r>
+    </w:p>
+    <w:p>
+      <w:pPr>
+        <w:ind w:left="360"/>
+      </w:pPr>
+      <w:r>
+        <w:t>{</w:t>
+      </w:r>
+    </w:p>
+    <w:p>
+      <w:pPr>
+        <w:ind w:left="360"/>
+      </w:pPr>
+      <w:r>
+        <w:t xml:space="preserve"> id: 10,</w:t>
+      </w:r>
+    </w:p>
+    <w:p>
+      <w:pPr>
+        <w:ind w:left="360"/>
+      </w:pPr>
+      <w:r>
+        <w:t xml:space="preserve"> nome: "Bruno Oliveira",</w:t>
+      </w:r>
+    </w:p>
+    <w:p>
+      <w:pPr>
+        <w:ind w:left="360"/>
+      </w:pPr>
+      <w:r>
+        <w:t xml:space="preserve"> </w:t>
+      </w:r>
+      <w:proofErr w:type="spellStart"/>
+      <w:r>
+        <w:t>ra</w:t>
+      </w:r>
+      <w:proofErr w:type="spellEnd"/>
+      <w:r>
+        <w:t>: 1010,</w:t>
+      </w:r>
+    </w:p>
+    <w:p>
+      <w:pPr>
+        <w:ind w:left="360"/>
+      </w:pPr>
+      <w:r>
+        <w:t xml:space="preserve"> disciplinas: [</w:t>
       </w:r>
     </w:p>
     <w:p>
@@ -1330,76 +1351,7 @@
       </w:r>
       <w:proofErr w:type="gramEnd"/>
       <w:r>
-        <w:t xml:space="preserve">: "História", nota: </w:t>
-      </w:r>
-      <w:proofErr w:type="gramStart"/>
-      <w:r>
-        <w:t>5 }</w:t>
-      </w:r>
-      <w:proofErr w:type="gramEnd"/>
-    </w:p>
-    <w:p>
-      <w:pPr>
-        <w:ind w:left="360"/>
-      </w:pPr>
-      <w:r>
-        <w:t xml:space="preserve"> ]</w:t>
-      </w:r>
-    </w:p>
-    <w:p>
-      <w:pPr>
-        <w:ind w:left="360"/>
-      </w:pPr>
-      <w:r>
-        <w:t>},</w:t>
-      </w:r>
-    </w:p>
-    <w:p>
-      <w:pPr>
-        <w:ind w:left="360"/>
-      </w:pPr>
-      <w:r>
-        <w:t>{</w:t>
-      </w:r>
-    </w:p>
-    <w:p>
-      <w:pPr>
-        <w:ind w:left="360"/>
-      </w:pPr>
-      <w:r>
-        <w:t xml:space="preserve"> id: 9,</w:t>
-      </w:r>
-    </w:p>
-    <w:p>
-      <w:pPr>
-        <w:ind w:left="360"/>
-      </w:pPr>
-      <w:r>
-        <w:t xml:space="preserve"> nome: "Camila Martins",</w:t>
-      </w:r>
-    </w:p>
-    <w:p>
-      <w:pPr>
-        <w:ind w:left="360"/>
-      </w:pPr>
-      <w:r>
-        <w:t xml:space="preserve"> </w:t>
-      </w:r>
-      <w:proofErr w:type="spellStart"/>
-      <w:r>
-        <w:t>ra</w:t>
-      </w:r>
-      <w:proofErr w:type="spellEnd"/>
-      <w:r>
-        <w:t>: 1009,</w:t>
-      </w:r>
-    </w:p>
-    <w:p>
-      <w:pPr>
-        <w:ind w:left="360"/>
-      </w:pPr>
-      <w:r>
-        <w:t xml:space="preserve"> disciplinas: [</w:t>
+        <w:t>: "Matemática", nota: 6 },</w:t>
       </w:r>
     </w:p>
     <w:p>
@@ -1415,15 +1367,7 @@
       </w:r>
       <w:proofErr w:type="gramEnd"/>
       <w:r>
-        <w:t xml:space="preserve">: "Português", nota: </w:t>
-      </w:r>
-      <w:proofErr w:type="gramStart"/>
-      <w:r>
-        <w:t>9 }</w:t>
-      </w:r>
-      <w:proofErr w:type="gramEnd"/>
-      <w:r>
-        <w:t>,</w:t>
+        <w:t>: "Física", nota: 7 },</w:t>
       </w:r>
     </w:p>
     <w:p>
@@ -1439,170 +1383,8 @@
       </w:r>
       <w:proofErr w:type="gramEnd"/>
       <w:r>
-        <w:t xml:space="preserve">: "História", nota: </w:t>
-      </w:r>
-      <w:proofErr w:type="gramStart"/>
-      <w:r>
-        <w:t>8 }</w:t>
-      </w:r>
-      <w:proofErr w:type="gramEnd"/>
-      <w:r>
-        <w:t>,</w:t>
-      </w:r>
-    </w:p>
-    <w:p>
-      <w:pPr>
-        <w:ind w:left="360"/>
-      </w:pPr>
-      <w:r>
-        <w:t xml:space="preserve">  </w:t>
-      </w:r>
-      <w:proofErr w:type="gramStart"/>
-      <w:r>
-        <w:t>{ nome</w:t>
-      </w:r>
-      <w:proofErr w:type="gramEnd"/>
-      <w:r>
-        <w:t xml:space="preserve">: "Geografia", nota: </w:t>
-      </w:r>
-      <w:proofErr w:type="gramStart"/>
-      <w:r>
-        <w:t>7 }</w:t>
-      </w:r>
-      <w:proofErr w:type="gramEnd"/>
-    </w:p>
-    <w:p>
-      <w:pPr>
-        <w:ind w:left="360"/>
-      </w:pPr>
-      <w:r>
-        <w:t xml:space="preserve"> ]</w:t>
-      </w:r>
-    </w:p>
-    <w:p>
-      <w:pPr>
-        <w:ind w:left="360"/>
-      </w:pPr>
-      <w:r>
-        <w:t>},</w:t>
-      </w:r>
-    </w:p>
-    <w:p>
-      <w:pPr>
-        <w:ind w:left="360"/>
-      </w:pPr>
-      <w:r>
-        <w:t>{</w:t>
-      </w:r>
-    </w:p>
-    <w:p>
-      <w:pPr>
-        <w:ind w:left="360"/>
-      </w:pPr>
-      <w:r>
-        <w:t xml:space="preserve"> id: 10,</w:t>
-      </w:r>
-    </w:p>
-    <w:p>
-      <w:pPr>
-        <w:ind w:left="360"/>
-      </w:pPr>
-      <w:r>
-        <w:t xml:space="preserve"> nome: "Bruno Oliveira",</w:t>
-      </w:r>
-    </w:p>
-    <w:p>
-      <w:pPr>
-        <w:ind w:left="360"/>
-      </w:pPr>
-      <w:r>
-        <w:t xml:space="preserve"> </w:t>
-      </w:r>
-      <w:proofErr w:type="spellStart"/>
-      <w:r>
-        <w:t>ra</w:t>
-      </w:r>
-      <w:proofErr w:type="spellEnd"/>
-      <w:r>
-        <w:t>: 1010,</w:t>
-      </w:r>
-    </w:p>
-    <w:p>
-      <w:pPr>
-        <w:ind w:left="360"/>
-      </w:pPr>
-      <w:r>
-        <w:t xml:space="preserve"> disciplinas: [</w:t>
-      </w:r>
-    </w:p>
-    <w:p>
-      <w:pPr>
-        <w:ind w:left="360"/>
-      </w:pPr>
-      <w:r>
-        <w:t xml:space="preserve">  </w:t>
-      </w:r>
-      <w:proofErr w:type="gramStart"/>
-      <w:r>
-        <w:t>{ nome</w:t>
-      </w:r>
-      <w:proofErr w:type="gramEnd"/>
-      <w:r>
-        <w:t xml:space="preserve">: "Matemática", nota: </w:t>
-      </w:r>
-      <w:proofErr w:type="gramStart"/>
-      <w:r>
-        <w:t>6 }</w:t>
-      </w:r>
-      <w:proofErr w:type="gramEnd"/>
-      <w:r>
-        <w:t>,</w:t>
-      </w:r>
-    </w:p>
-    <w:p>
-      <w:pPr>
-        <w:ind w:left="360"/>
-      </w:pPr>
-      <w:r>
-        <w:t xml:space="preserve">  </w:t>
-      </w:r>
-      <w:proofErr w:type="gramStart"/>
-      <w:r>
-        <w:t>{ nome</w:t>
-      </w:r>
-      <w:proofErr w:type="gramEnd"/>
-      <w:r>
-        <w:t xml:space="preserve">: "Física", nota: </w:t>
-      </w:r>
-      <w:proofErr w:type="gramStart"/>
-      <w:r>
-        <w:t>7 }</w:t>
-      </w:r>
-      <w:proofErr w:type="gramEnd"/>
-      <w:r>
-        <w:t>,</w:t>
-      </w:r>
-    </w:p>
-    <w:p>
-      <w:pPr>
-        <w:ind w:left="360"/>
-      </w:pPr>
-      <w:r>
-        <w:t xml:space="preserve">  </w:t>
-      </w:r>
-      <w:proofErr w:type="gramStart"/>
-      <w:r>
-        <w:t>{ nome</w:t>
-      </w:r>
-      <w:proofErr w:type="gramEnd"/>
-      <w:r>
-        <w:t xml:space="preserve">: "Química", nota: </w:t>
-      </w:r>
-      <w:proofErr w:type="gramStart"/>
-      <w:r>
-        <w:t>8 }</w:t>
-      </w:r>
-      <w:proofErr w:type="gramEnd"/>
+        <w:t>: "Química", nota: 8 }</w:t>
+      </w:r>
     </w:p>
     <w:p>
       <w:pPr>
@@ -1690,6 +1472,24 @@
     <w:p>
       <w:pPr>
         <w:pStyle w:val="NormalWeb"/>
+      </w:pPr>
+      <w:proofErr w:type="spellStart"/>
+      <w:proofErr w:type="gramStart"/>
+      <w:r>
+        <w:t>db.alunos</w:t>
+      </w:r>
+      <w:proofErr w:type="gramEnd"/>
+      <w:r>
+        <w:t>.find</w:t>
+      </w:r>
+      <w:proofErr w:type="spellEnd"/>
+      <w:r>
+        <w:t>()</w:t>
+      </w:r>
+    </w:p>
+    <w:p>
+      <w:pPr>
+        <w:pStyle w:val="NormalWeb"/>
         <w:numPr>
           <w:ilvl w:val="0"/>
           <w:numId w:val="4"/>
@@ -1712,6 +1512,14 @@
     <w:p>
       <w:pPr>
         <w:pStyle w:val="NormalWeb"/>
+        <w:rPr>
+          <w:u w:val="single"/>
+        </w:rPr>
+      </w:pPr>
+    </w:p>
+    <w:p>
+      <w:pPr>
+        <w:pStyle w:val="NormalWeb"/>
         <w:numPr>
           <w:ilvl w:val="0"/>
           <w:numId w:val="4"/>
@@ -1734,6 +1542,11 @@
     <w:p>
       <w:pPr>
         <w:pStyle w:val="NormalWeb"/>
+      </w:pPr>
+    </w:p>
+    <w:p>
+      <w:pPr>
+        <w:pStyle w:val="NormalWeb"/>
         <w:numPr>
           <w:ilvl w:val="0"/>
           <w:numId w:val="4"/>
@@ -1761,6 +1574,19 @@
     <w:p>
       <w:pPr>
         <w:pStyle w:val="NormalWeb"/>
+      </w:pPr>
+      <w:proofErr w:type="gramStart"/>
+      <w:r>
+        <w:t>db.alunos</w:t>
+      </w:r>
+      <w:proofErr w:type="gramEnd"/>
+      <w:r>
+        <w:t>.find({"disciplinas.nome":"Matemática"},{_id:0,nome:1,ra:1})</w:t>
+      </w:r>
+    </w:p>
+    <w:p>
+      <w:pPr>
+        <w:pStyle w:val="NormalWeb"/>
         <w:numPr>
           <w:ilvl w:val="0"/>
           <w:numId w:val="4"/>
@@ -1783,6 +1609,11 @@
     <w:p>
       <w:pPr>
         <w:pStyle w:val="NormalWeb"/>
+      </w:pPr>
+    </w:p>
+    <w:p>
+      <w:pPr>
+        <w:pStyle w:val="NormalWeb"/>
         <w:numPr>
           <w:ilvl w:val="0"/>
           <w:numId w:val="4"/>
@@ -1817,6 +1648,34 @@
     <w:p>
       <w:pPr>
         <w:pStyle w:val="NormalWeb"/>
+      </w:pPr>
+      <w:proofErr w:type="gramStart"/>
+      <w:r>
+        <w:t>db.alunos</w:t>
+      </w:r>
+      <w:proofErr w:type="gramEnd"/>
+      <w:r>
+        <w:t>.find({$and:[{"disciplinas.nome":"Matemáti</w:t>
+      </w:r>
+      <w:r>
+        <w:t>c</w:t>
+      </w:r>
+      <w:r>
+        <w:t>a"},{"disciplinas.nota":{$gt:</w:t>
+      </w:r>
+      <w:r>
+        <w:t>8</w:t>
+      </w:r>
+      <w:r>
+        <w:t>}}]},{_id:0,nome:1,ra:1}</w:t>
+      </w:r>
+      <w:r>
+        <w:t>)</w:t>
+      </w:r>
+    </w:p>
+    <w:p>
+      <w:pPr>
+        <w:pStyle w:val="NormalWeb"/>
         <w:numPr>
           <w:ilvl w:val="0"/>
           <w:numId w:val="4"/>
@@ -1839,6 +1698,19 @@
     <w:p>
       <w:pPr>
         <w:pStyle w:val="NormalWeb"/>
+      </w:pPr>
+      <w:proofErr w:type="gramStart"/>
+      <w:r>
+        <w:t>db.alunos</w:t>
+      </w:r>
+      <w:proofErr w:type="gramEnd"/>
+      <w:r>
+        <w:t>.find({$or:[{"disciplinas.nome":"Matemática"},{"disciplinas.nome":"Física"}]},{_id:0,nome:1,ra:1})</w:t>
+      </w:r>
+    </w:p>
+    <w:p>
+      <w:pPr>
+        <w:pStyle w:val="NormalWeb"/>
         <w:numPr>
           <w:ilvl w:val="0"/>
           <w:numId w:val="4"/>
@@ -1861,6 +1733,11 @@
     <w:p>
       <w:pPr>
         <w:pStyle w:val="NormalWeb"/>
+      </w:pPr>
+    </w:p>
+    <w:p>
+      <w:pPr>
+        <w:pStyle w:val="NormalWeb"/>
         <w:numPr>
           <w:ilvl w:val="0"/>
           <w:numId w:val="4"/>
@@ -1886,17 +1763,8 @@
           <w:rStyle w:val="Forte"/>
           <w:rFonts w:eastAsiaTheme="majorEastAsia"/>
         </w:rPr>
-        <w:t xml:space="preserve"> ou </w:t>
-      </w:r>
-      <w:proofErr w:type="gramStart"/>
-      <w:r>
-        <w:rPr>
-          <w:rStyle w:val="Forte"/>
-          <w:rFonts w:eastAsiaTheme="majorEastAsia"/>
-        </w:rPr>
-        <w:t>Português</w:t>
-      </w:r>
-      <w:proofErr w:type="gramEnd"/>
+        <w:t xml:space="preserve"> ou Português</w:t>
+      </w:r>
       <w:r>
         <w:t xml:space="preserve"> utilizando o operador </w:t>
       </w:r>
@@ -1915,6 +1783,24 @@
     </w:p>
     <w:p>
       <w:pPr>
+        <w:pStyle w:val="PargrafodaLista"/>
+      </w:pPr>
+    </w:p>
+    <w:p>
+      <w:pPr>
+        <w:pStyle w:val="NormalWeb"/>
+      </w:pPr>
+      <w:proofErr w:type="gramStart"/>
+      <w:r>
+        <w:t>db.alunos</w:t>
+      </w:r>
+      <w:proofErr w:type="gramEnd"/>
+      <w:r>
+        <w:t>.find({"disciplinas.nome":{$in:["Matemática","Português"]}},{_id:0,nome:1,ra:1})</w:t>
+      </w:r>
+    </w:p>
+    <w:p>
+      <w:pPr>
         <w:pStyle w:val="NormalWeb"/>
         <w:numPr>
           <w:ilvl w:val="0"/>
@@ -1952,7 +1838,7 @@
     </w:p>
     <w:sectPr>
       <w:pgSz w:w="11906" w:h="16838"/>
-      <w:pgMar w:top="1417" w:right="1701" w:bottom="1417" w:left="1701" w:header="708" w:footer="708" w:gutter="0"/>
+      <w:pgMar w:top="720" w:right="720" w:bottom="720" w:left="720" w:header="708" w:footer="708" w:gutter="0"/>
       <w:cols w:space="708"/>
       <w:docGrid w:linePitch="360"/>
     </w:sectPr>
@@ -1961,7 +1847,7 @@
 </file>
 
 <file path=word/numbering.xml><?xml version="1.0" encoding="utf-8"?>
-<w:numbering xmlns:wpc="http://schemas.microsoft.com/office/word/2010/wordprocessingCanvas" xmlns:cx="http://schemas.microsoft.com/office/drawing/2014/chartex" xmlns:cx1="http://schemas.microsoft.com/office/drawing/2015/9/8/chartex" xmlns:cx2="http://schemas.microsoft.com/office/drawing/2015/10/21/chartex" xmlns:cx3="http://schemas.microsoft.com/office/drawing/2016/5/9/chartex" xmlns:cx4="http://schemas.microsoft.com/office/drawing/2016/5/10/chartex" xmlns:cx5="http://schemas.microsoft.com/office/drawing/2016/5/11/chartex" xmlns:cx6="http://schemas.microsoft.com/office/drawing/2016/5/12/chartex" xmlns:cx7="http://schemas.microsoft.com/office/drawing/2016/5/13/chartex" xmlns:cx8="http://schemas.microsoft.com/office/drawing/2016/5/14/chartex" xmlns:mc="http://schemas.openxmlformats.org/markup-compatibility/2006" xmlns:aink="http://schemas.microsoft.com/office/drawing/2016/ink" xmlns:am3d="http://schemas.microsoft.com/office/drawing/2017/model3d" xmlns:o="urn:schemas-microsoft-com:office:office" xmlns:oel="http://schemas.microsoft.com/office/2019/extlst" xmlns:r="http://schemas.openxmlformats.org/officeDocument/2006/relationships" xmlns:m="http://schemas.openxmlformats.org/officeDocument/2006/math" xmlns:v="urn:schemas-microsoft-com:vml" xmlns:wp14="http://schemas.microsoft.com/office/word/2010/wordprocessingDrawing" xmlns:wp="http://schemas.openxmlformats.org/drawingml/2006/wordprocessingDrawing" xmlns:w10="urn:schemas-microsoft-com:office:word" xmlns:w="http://schemas.openxmlformats.org/wordprocessingml/2006/main" xmlns:w14="http://schemas.microsoft.com/office/word/2010/wordml" xmlns:w15="http://schemas.microsoft.com/office/word/2012/wordml" xmlns:w16cex="http://schemas.microsoft.com/office/word/2018/wordml/cex" xmlns:w16cid="http://schemas.microsoft.com/office/word/2016/wordml/cid" xmlns:w16="http://schemas.microsoft.com/office/word/2018/wordml" xmlns:w16du="http://schemas.microsoft.com/office/word/2023/wordml/word16du" xmlns:w16sdtdh="http://schemas.microsoft.com/office/word/2020/wordml/sdtdatahash" xmlns:w16sdtfl="http://schemas.microsoft.com/office/word/2024/wordml/sdtformatlock" xmlns:w16se="http://schemas.microsoft.com/office/word/2015/wordml/symex" xmlns:wpg="http://schemas.microsoft.com/office/word/2010/wordprocessingGroup" xmlns:wpi="http://schemas.microsoft.com/office/word/2010/wordprocessingInk" xmlns:wne="http://schemas.microsoft.com/office/word/2006/wordml" xmlns:wps="http://schemas.microsoft.com/office/word/2010/wordprocessingShape" mc:Ignorable="w14 w15 w16se w16cid w16 w16cex w16sdtdh w16sdtfl w16du wp14">
+<w:numbering xmlns:wpc="http://schemas.microsoft.com/office/word/2010/wordprocessingCanvas" xmlns:cx="http://schemas.microsoft.com/office/drawing/2014/chartex" xmlns:cx1="http://schemas.microsoft.com/office/drawing/2015/9/8/chartex" xmlns:cx2="http://schemas.microsoft.com/office/drawing/2015/10/21/chartex" xmlns:cx3="http://schemas.microsoft.com/office/drawing/2016/5/9/chartex" xmlns:cx4="http://schemas.microsoft.com/office/drawing/2016/5/10/chartex" xmlns:cx5="http://schemas.microsoft.com/office/drawing/2016/5/11/chartex" xmlns:cx6="http://schemas.microsoft.com/office/drawing/2016/5/12/chartex" xmlns:cx7="http://schemas.microsoft.com/office/drawing/2016/5/13/chartex" xmlns:cx8="http://schemas.microsoft.com/office/drawing/2016/5/14/chartex" xmlns:mc="http://schemas.openxmlformats.org/markup-compatibility/2006" xmlns:aink="http://schemas.microsoft.com/office/drawing/2016/ink" xmlns:am3d="http://schemas.microsoft.com/office/drawing/2017/model3d" xmlns:o="urn:schemas-microsoft-com:office:office" xmlns:r="http://schemas.openxmlformats.org/officeDocument/2006/relationships" xmlns:m="http://schemas.openxmlformats.org/officeDocument/2006/math" xmlns:v="urn:schemas-microsoft-com:vml" xmlns:wp14="http://schemas.microsoft.com/office/word/2010/wordprocessingDrawing" xmlns:wp="http://schemas.openxmlformats.org/drawingml/2006/wordprocessingDrawing" xmlns:w10="urn:schemas-microsoft-com:office:word" xmlns:w="http://schemas.openxmlformats.org/wordprocessingml/2006/main" xmlns:w14="http://schemas.microsoft.com/office/word/2010/wordml" xmlns:w15="http://schemas.microsoft.com/office/word/2012/wordml" xmlns:w16cex="http://schemas.microsoft.com/office/word/2018/wordml/cex" xmlns:w16cid="http://schemas.microsoft.com/office/word/2016/wordml/cid" xmlns:w16="http://schemas.microsoft.com/office/word/2018/wordml" xmlns:w16sdtdh="http://schemas.microsoft.com/office/word/2020/wordml/sdtdatahash" xmlns:w16se="http://schemas.microsoft.com/office/word/2015/wordml/symex" xmlns:wpg="http://schemas.microsoft.com/office/word/2010/wordprocessingGroup" xmlns:wpi="http://schemas.microsoft.com/office/word/2010/wordprocessingInk" xmlns:wne="http://schemas.microsoft.com/office/word/2006/wordml" xmlns:wps="http://schemas.microsoft.com/office/word/2010/wordprocessingShape" mc:Ignorable="w14 w15 w16se w16cid w16 w16cex w16sdtdh wp14">
   <w:abstractNum w:abstractNumId="0" w15:restartNumberingAfterBreak="0">
     <w:nsid w:val="01AC5D1C"/>
     <w:multiLevelType w:val="multilevel"/>
@@ -2423,23 +2309,23 @@
       </w:pPr>
     </w:lvl>
   </w:abstractNum>
-  <w:num w:numId="1" w16cid:durableId="94908221">
+  <w:num w:numId="1">
     <w:abstractNumId w:val="2"/>
   </w:num>
-  <w:num w:numId="2" w16cid:durableId="1867479507">
+  <w:num w:numId="2">
     <w:abstractNumId w:val="1"/>
   </w:num>
-  <w:num w:numId="3" w16cid:durableId="63577368">
+  <w:num w:numId="3">
     <w:abstractNumId w:val="3"/>
   </w:num>
-  <w:num w:numId="4" w16cid:durableId="1208762260">
+  <w:num w:numId="4">
     <w:abstractNumId w:val="0"/>
   </w:num>
 </w:numbering>
 </file>
 
 <file path=word/styles.xml><?xml version="1.0" encoding="utf-8"?>
-<w:styles xmlns:mc="http://schemas.openxmlformats.org/markup-compatibility/2006" xmlns:r="http://schemas.openxmlformats.org/officeDocument/2006/relationships" xmlns:w="http://schemas.openxmlformats.org/wordprocessingml/2006/main" xmlns:w14="http://schemas.microsoft.com/office/word/2010/wordml" xmlns:w15="http://schemas.microsoft.com/office/word/2012/wordml" xmlns:w16cex="http://schemas.microsoft.com/office/word/2018/wordml/cex" xmlns:w16cid="http://schemas.microsoft.com/office/word/2016/wordml/cid" xmlns:w16="http://schemas.microsoft.com/office/word/2018/wordml" xmlns:w16du="http://schemas.microsoft.com/office/word/2023/wordml/word16du" xmlns:w16sdtdh="http://schemas.microsoft.com/office/word/2020/wordml/sdtdatahash" xmlns:w16sdtfl="http://schemas.microsoft.com/office/word/2024/wordml/sdtformatlock" xmlns:w16se="http://schemas.microsoft.com/office/word/2015/wordml/symex" mc:Ignorable="w14 w15 w16se w16cid w16 w16cex w16sdtdh w16sdtfl w16du">
+<w:styles xmlns:mc="http://schemas.openxmlformats.org/markup-compatibility/2006" xmlns:r="http://schemas.openxmlformats.org/officeDocument/2006/relationships" xmlns:w="http://schemas.openxmlformats.org/wordprocessingml/2006/main" xmlns:w14="http://schemas.microsoft.com/office/word/2010/wordml" xmlns:w15="http://schemas.microsoft.com/office/word/2012/wordml" xmlns:w16cex="http://schemas.microsoft.com/office/word/2018/wordml/cex" xmlns:w16cid="http://schemas.microsoft.com/office/word/2016/wordml/cid" xmlns:w16="http://schemas.microsoft.com/office/word/2018/wordml" xmlns:w16sdtdh="http://schemas.microsoft.com/office/word/2020/wordml/sdtdatahash" xmlns:w16se="http://schemas.microsoft.com/office/word/2015/wordml/symex" mc:Ignorable="w14 w15 w16se w16cid w16 w16cex w16sdtdh">
   <w:docDefaults>
     <w:rPrDefault>
       <w:rPr>
@@ -3354,7 +3240,6 @@
     <w:name w:val="Normal (Web)"/>
     <w:basedOn w:val="Normal"/>
     <w:uiPriority w:val="99"/>
-    <w:semiHidden/>
     <w:unhideWhenUsed/>
     <w:rsid w:val="00AC28C3"/>
     <w:pPr>
@@ -3702,4 +3587,16 @@
     </a:ext>
   </a:extLst>
 </a:theme>
+</file>
+
+<file path=customXml/item1.xml><?xml version="1.0" encoding="utf-8"?>
+<b:Sources xmlns:b="http://schemas.openxmlformats.org/officeDocument/2006/bibliography" xmlns="http://schemas.openxmlformats.org/officeDocument/2006/bibliography" SelectedStyle="\APASixthEditionOfficeOnline.xsl" StyleName="APA" Version="6"/>
+</file>
+
+<file path=customXml/itemProps1.xml><?xml version="1.0" encoding="utf-8"?>
+<ds:datastoreItem xmlns:ds="http://schemas.openxmlformats.org/officeDocument/2006/customXml" ds:itemID="{E03F8490-ED56-4854-AEC8-437C3C92D8BD}">
+  <ds:schemaRefs>
+    <ds:schemaRef ds:uri="http://schemas.openxmlformats.org/officeDocument/2006/bibliography"/>
+  </ds:schemaRefs>
+</ds:datastoreItem>
 </file>
</xml_diff>